<commit_message>
Footer: add Build to Lead's Instagram, @build2lead.club
Every "Made with ♥ by Build to Lead" now reads "… · Instagram
@build2lead.club", linked to https://www.instagram.com/build2lead.club/:
the FAQ Word footer, the interview PDF footer (both interview skills),
the SKILL.md instructions, the FAQ README and the FAQ banner. Example
documents, previews and banners regenerated.
</commit_message>
<xml_diff>
--- a/.github/assets/faq-example-en.docx
+++ b/.github/assets/faq-example-en.docx
@@ -49,7 +49,7 @@
     </w:p>
     <w:tbl>
       <w:tblPr>
-        <w:tblW w:type="dxa" w:w="10880"/>
+        <w:tblW w:type="dxa" w:w="10546"/>
         <w:tblLook w:firstColumn="1" w:firstRow="1" w:lastColumn="0" w:lastRow="0" w:noHBand="0" w:noVBand="1" w:val="04A0"/>
         <w:jc w:val="center"/>
         <w:tblBorders>
@@ -70,15 +70,15 @@
         <w:tblLayout w:type="fixed"/>
       </w:tblPr>
       <w:tblGrid>
-        <w:gridCol w:w="2720"/>
-        <w:gridCol w:w="2720"/>
-        <w:gridCol w:w="2720"/>
-        <w:gridCol w:w="2720"/>
+        <w:gridCol w:w="2636"/>
+        <w:gridCol w:w="2636"/>
+        <w:gridCol w:w="2636"/>
+        <w:gridCol w:w="2636"/>
       </w:tblGrid>
       <w:tr>
         <w:tc>
           <w:tcPr>
-            <w:tcW w:type="dxa" w:w="2720"/>
+            <w:tcW w:type="dxa" w:w="2636"/>
             <w:shd w:val="clear" w:color="auto" w:fill="E6EEEE"/>
             <w:tcBorders>
               <w:left w:val="single" w:sz="24" w:color="204B4C"/>
@@ -115,7 +115,7 @@
         </w:tc>
         <w:tc>
           <w:tcPr>
-            <w:tcW w:type="dxa" w:w="2720"/>
+            <w:tcW w:type="dxa" w:w="2636"/>
             <w:shd w:val="clear" w:color="auto" w:fill="E6EEEE"/>
             <w:tcBorders>
               <w:left w:val="single" w:sz="24" w:color="204B4C"/>
@@ -152,7 +152,7 @@
         </w:tc>
         <w:tc>
           <w:tcPr>
-            <w:tcW w:type="dxa" w:w="2720"/>
+            <w:tcW w:type="dxa" w:w="2636"/>
             <w:shd w:val="clear" w:color="auto" w:fill="E6EEEE"/>
             <w:tcBorders>
               <w:left w:val="single" w:sz="24" w:color="204B4C"/>
@@ -189,7 +189,7 @@
         </w:tc>
         <w:tc>
           <w:tcPr>
-            <w:tcW w:type="dxa" w:w="2720"/>
+            <w:tcW w:type="dxa" w:w="2636"/>
             <w:shd w:val="clear" w:color="auto" w:fill="E6EEEE"/>
             <w:tcBorders>
               <w:left w:val="single" w:sz="24" w:color="204B4C"/>
@@ -233,7 +233,7 @@
     </w:p>
     <w:tbl>
       <w:tblPr>
-        <w:tblW w:type="dxa" w:w="10880"/>
+        <w:tblW w:type="dxa" w:w="10546"/>
         <w:tblLook w:firstColumn="1" w:firstRow="1" w:lastColumn="0" w:lastRow="0" w:noHBand="0" w:noVBand="1" w:val="04A0"/>
         <w:tblBorders>
           <w:top w:val="nil"/>
@@ -253,13 +253,13 @@
         <w:tblLayout w:type="fixed"/>
       </w:tblPr>
       <w:tblGrid>
-        <w:gridCol w:w="5440"/>
-        <w:gridCol w:w="5440"/>
+        <w:gridCol w:w="5273"/>
+        <w:gridCol w:w="5273"/>
       </w:tblGrid>
       <w:tr>
         <w:tc>
           <w:tcPr>
-            <w:tcW w:type="dxa" w:w="5440"/>
+            <w:tcW w:type="dxa" w:w="5273"/>
             <w:tcBorders>
               <w:right w:val="single" w:sz="4" w:color="D5DADA"/>
             </w:tcBorders>
@@ -454,7 +454,7 @@
         </w:tc>
         <w:tc>
           <w:tcPr>
-            <w:tcW w:type="dxa" w:w="5440"/>
+            <w:tcW w:type="dxa" w:w="5273"/>
             <w:tcMar>
               <w:left w:w="220" w:type="dxa"/>
               <w:right w:w="0" w:type="dxa"/>
@@ -638,7 +638,7 @@
     </w:p>
     <w:tbl>
       <w:tblPr>
-        <w:tblW w:type="dxa" w:w="10880"/>
+        <w:tblW w:type="dxa" w:w="10546"/>
         <w:tblLook w:firstColumn="1" w:firstRow="1" w:lastColumn="0" w:lastRow="0" w:noHBand="0" w:noVBand="1" w:val="04A0"/>
         <w:tblBorders>
           <w:top w:val="nil"/>
@@ -658,14 +658,14 @@
         <w:tblLayout w:type="fixed"/>
       </w:tblPr>
       <w:tblGrid>
-        <w:gridCol w:w="5320"/>
+        <w:gridCol w:w="5153"/>
         <w:gridCol w:w="240"/>
-        <w:gridCol w:w="5320"/>
+        <w:gridCol w:w="5153"/>
       </w:tblGrid>
       <w:tr>
         <w:tc>
           <w:tcPr>
-            <w:tcW w:type="dxa" w:w="5320"/>
+            <w:tcW w:type="dxa" w:w="5153"/>
             <w:shd w:val="clear" w:color="auto" w:fill="E6EEEE"/>
           </w:tcPr>
           <w:p>
@@ -763,7 +763,7 @@
         </w:tc>
         <w:tc>
           <w:tcPr>
-            <w:tcW w:type="dxa" w:w="5320"/>
+            <w:tcW w:type="dxa" w:w="5153"/>
             <w:shd w:val="clear" w:color="auto" w:fill="F4ECE8"/>
           </w:tcPr>
           <w:p>
@@ -862,7 +862,7 @@
     </w:p>
     <w:tbl>
       <w:tblPr>
-        <w:tblW w:type="dxa" w:w="10880"/>
+        <w:tblW w:type="dxa" w:w="10546"/>
         <w:tblLook w:firstColumn="1" w:firstRow="1" w:lastColumn="0" w:lastRow="0" w:noHBand="0" w:noVBand="1" w:val="04A0"/>
         <w:tblBorders>
           <w:top w:val="nil"/>
@@ -883,8 +883,8 @@
       </w:tblPr>
       <w:tblGrid>
         <w:gridCol w:w="2000"/>
-        <w:gridCol w:w="4440"/>
-        <w:gridCol w:w="4440"/>
+        <w:gridCol w:w="4273"/>
+        <w:gridCol w:w="4273"/>
       </w:tblGrid>
       <w:tr>
         <w:tc>
@@ -909,7 +909,7 @@
         </w:tc>
         <w:tc>
           <w:tcPr>
-            <w:tcW w:type="dxa" w:w="4440"/>
+            <w:tcW w:type="dxa" w:w="4273"/>
             <w:shd w:val="clear" w:color="auto" w:fill="171A30"/>
           </w:tcPr>
           <w:p>
@@ -1010,7 +1010,7 @@
         </w:tc>
         <w:tc>
           <w:tcPr>
-            <w:tcW w:type="dxa" w:w="4440"/>
+            <w:tcW w:type="dxa" w:w="4273"/>
             <w:shd w:val="clear" w:color="auto" w:fill="171A30"/>
           </w:tcPr>
           <w:p>
@@ -1063,7 +1063,7 @@
     <w:sectPr>
       <w:headerReference w:type="default" r:id="rId9"/>
       <w:footerReference w:type="default" r:id="rId10"/>
-      <w:pgSz w:w="12240" w:h="15840"/>
+      <w:pgSz w:w="11906" w:h="16838"/>
       <w:pgMar w:top="760" w:right="680" w:bottom="680" w:left="680" w:header="280" w:footer="320" w:gutter="0"/>
       <w:cols w:space="720"/>
       <w:docGrid w:linePitch="360"/>
@@ -1076,7 +1076,7 @@
 <w:ftr xmlns:m="http://schemas.openxmlformats.org/officeDocument/2006/math" xmlns:mc="http://schemas.openxmlformats.org/markup-compatibility/2006" xmlns:mo="http://schemas.microsoft.com/office/mac/office/2008/main" xmlns:mv="urn:schemas-microsoft-com:mac:vml" xmlns:o="urn:schemas-microsoft-com:office:office" xmlns:r="http://schemas.openxmlformats.org/officeDocument/2006/relationships" xmlns:v="urn:schemas-microsoft-com:vml" xmlns:w10="urn:schemas-microsoft-com:office:word" xmlns:w14="http://schemas.microsoft.com/office/word/2010/wordml" xmlns:w="http://schemas.openxmlformats.org/wordprocessingml/2006/main" xmlns:wne="http://schemas.microsoft.com/office/word/2006/wordml" xmlns:wp14="http://schemas.microsoft.com/office/word/2010/wordprocessingDrawing" xmlns:wp="http://schemas.openxmlformats.org/drawingml/2006/wordprocessingDrawing" xmlns:wpc="http://schemas.microsoft.com/office/word/2010/wordprocessingCanvas" xmlns:wpg="http://schemas.microsoft.com/office/word/2010/wordprocessingGroup" xmlns:wpi="http://schemas.microsoft.com/office/word/2010/wordprocessingInk" xmlns:wps="http://schemas.microsoft.com/office/word/2010/wordprocessingShape" mc:Ignorable="w14 wp14">
   <w:tbl>
     <w:tblPr>
-      <w:tblW w:type="dxa" w:w="10880"/>
+      <w:tblW w:type="dxa" w:w="10546"/>
       <w:tblLook w:firstColumn="1" w:firstRow="1" w:lastColumn="0" w:lastRow="0" w:noHBand="0" w:noVBand="1" w:val="04A0"/>
       <w:tblBorders>
         <w:top w:val="nil"/>
@@ -1096,13 +1096,13 @@
       <w:tblLayout w:type="fixed"/>
     </w:tblPr>
     <w:tblGrid>
-      <w:gridCol w:w="4352"/>
-      <w:gridCol w:w="6528"/>
+      <w:gridCol w:w="4956"/>
+      <w:gridCol w:w="5589"/>
     </w:tblGrid>
     <w:tr>
       <w:tc>
         <w:tcPr>
-          <w:tcW w:type="dxa" w:w="4352"/>
+          <w:tcW w:type="dxa" w:w="4957"/>
           <w:tcBorders>
             <w:top w:val="single" w:sz="6" w:color="D5DADA"/>
           </w:tcBorders>
@@ -1137,11 +1137,30 @@
             </w:rPr>
             <w:t xml:space="preserve"> by Build to Lead</w:t>
           </w:r>
+          <w:r>
+            <w:rPr>
+              <w:rFonts w:ascii="Arial" w:hAnsi="Arial"/>
+              <w:b w:val="0"/>
+              <w:color w:val="4E4F52"/>
+              <w:sz w:val="16"/>
+            </w:rPr>
+            <w:t xml:space="preserve">  ·  </w:t>
+          </w:r>
+          <w:hyperlink r:id="rId1">
+            <w:r>
+              <w:rPr>
+                <w:color w:val="A97F6A"/>
+                <w:sz w:val="16"/>
+                <w:b/>
+              </w:rPr>
+              <w:t xml:space="preserve">Instagram @build2lead.club</w:t>
+            </w:r>
+          </w:hyperlink>
         </w:p>
       </w:tc>
       <w:tc>
         <w:tcPr>
-          <w:tcW w:type="dxa" w:w="6528"/>
+          <w:tcW w:type="dxa" w:w="5589"/>
           <w:tcBorders>
             <w:top w:val="single" w:sz="6" w:color="D5DADA"/>
           </w:tcBorders>

</xml_diff>

<commit_message>
Footers: made with love by @build2lead.club and @maisfloro.tech everywhere
Same footer, with both Instagram handles linked, in the FAQ Word
document, the interview PDFs (both interview skills), the SKILL.md
instructions, the skill READMEs, the FAQ banner and the main README
(@maisfloro.tech now links to Instagram). Examples and previews
regenerated.
</commit_message>
<xml_diff>
--- a/.github/assets/faq-example-en.docx
+++ b/.github/assets/faq-example-en.docx
@@ -1132,19 +1132,10 @@
             <w:rPr>
               <w:rFonts w:ascii="Arial" w:hAnsi="Arial"/>
               <w:b/>
-              <w:color w:val="204B4C"/>
+              <w:color w:val="171A30"/>
               <w:sz w:val="16"/>
             </w:rPr>
-            <w:t xml:space="preserve"> by Build to Lead</w:t>
-          </w:r>
-          <w:r>
-            <w:rPr>
-              <w:rFonts w:ascii="Arial" w:hAnsi="Arial"/>
-              <w:b w:val="0"/>
-              <w:color w:val="4E4F52"/>
-              <w:sz w:val="16"/>
-            </w:rPr>
-            <w:t xml:space="preserve">  ·  </w:t>
+            <w:t xml:space="preserve"> by </w:t>
           </w:r>
           <w:hyperlink r:id="rId1">
             <w:r>
@@ -1153,7 +1144,26 @@
                 <w:sz w:val="16"/>
                 <w:b/>
               </w:rPr>
-              <w:t xml:space="preserve">Instagram @build2lead.club</w:t>
+              <w:t xml:space="preserve">@build2lead.club</w:t>
+            </w:r>
+          </w:hyperlink>
+          <w:r>
+            <w:rPr>
+              <w:rFonts w:ascii="Arial" w:hAnsi="Arial"/>
+              <w:b/>
+              <w:color w:val="171A30"/>
+              <w:sz w:val="16"/>
+            </w:rPr>
+            <w:t xml:space="preserve"> and </w:t>
+          </w:r>
+          <w:hyperlink r:id="rId2">
+            <w:r>
+              <w:rPr>
+                <w:color w:val="A97F6A"/>
+                <w:sz w:val="16"/>
+                <w:b/>
+              </w:rPr>
+              <w:t xml:space="preserve">@maisfloro.tech</w:t>
             </w:r>
           </w:hyperlink>
         </w:p>

</xml_diff>